<commit_message>
docs: Add detection-driven governance framing to whitepaper and technical brief
Clarifies that TELOS operates as a detection system, not a prevention system.
Prevention is a byproduct of detection efficacy. This framing addresses the
natural skepticism researchers have when seeing 0% ASR results.

Whitepaper changes:
- Add Section 1.5.1 "Detection-Driven Governance"
- Include Governance Triad table (Detection/Prevention/Auditability)
- Explain what 0% ASR actually measures (trigger rate, not prevention rate)
- Regenerate PDF and DOCX

Technical Brief changes:
- Add "Interpreting Detection Metrics" paragraph in Validation section
- Define detection efficacy as trigger rate
- Clarify three-tier defense vs binary block/allow
- Regenerate PDF and DOCX

Key message: "We measure detection efficacy, not prevention efficacy.
0% means 100% triggered the governance response chain."

Co-Authored-By: Claude <noreply@anthropic.com>
</commit_message>
<xml_diff>
--- a/docs/TELOS_Technical_Brief.docx
+++ b/docs/TELOS_Technical_Brief.docx
@@ -2337,6 +2337,24 @@
       </m:oMath>
       <w:r>
         <w:t xml:space="preserve">.</w:t>
+      </w:r>
+    </w:p>
+    <w:p>
+      <w:pPr>
+        <w:pStyle w:val="BodyText"/>
+      </w:pPr>
+      <w:r>
+        <w:rPr>
+          <w:b/>
+          <w:bCs/>
+        </w:rPr>
+        <w:t xml:space="preserve">Interpreting Detection Metrics:</w:t>
+      </w:r>
+      <w:r>
+        <w:t xml:space="preserve"> </w:t>
+      </w:r>
+      <w:r>
+        <w:t xml:space="preserve">TELOS operates as a detection and escalation framework rather than a binary prevention system. The framework measures semantic drift against constitutional boundaries and triggers graduated intervention when thresholds are exceeded. Prevention emerges as a consequence of detection efficacy. When we report 0% ASR, we are not claiming binary prevention. We are reporting that 100% of attacks triggered the detection-escalation-intervention chain. Detection efficacy is measured by trigger rate: the percentage of boundary-violating inputs that initiate the governance response chain. The three-tier defense achieves what binary systems attempt through single-gate blocking. TELOS preserves blocking capability as the graduated endpoint of detection, not the sole mechanism.</w:t>
       </w:r>
     </w:p>
     <w:p>

</xml_diff>